<commit_message>
fix(assets-docs): XML compliant SVG assets with 4K UHD PNG rendering, robust LaTeX/Mermaid formatting, and scrubbed academic metadata
</commit_message>
<xml_diff>
--- a/docs/Fase_1_Definicion_Proyecto_APT/Diario_Reflexion_Fase_1/Urrea_Bruno_1.2_APT122_DiarioReflexionFase1.docx
+++ b/docs/Fase_1_Definicion_Proyecto_APT/Diario_Reflexion_Fase_1/Urrea_Bruno_1.2_APT122_DiarioReflexionFase1.docx
@@ -40,7 +40,7 @@
           <w:color w:val="505050"/>
           <w:sz w:val="20"/>
         </w:rPr>
-        <w:t>¿Cuáles son las asignaturas o certificados que más motivaron tu aprendizaje y se relacionan con tus intereses profesionales? ¿Por qué?</w:t>
+        <w:t>¿Cuáles son las asignaturas o certificados que más motivaron tu aprendizaje y se relacionan con tus intereses profesionales?</w:t>
       </w:r>
     </w:p>
     <w:p>
@@ -48,7 +48,7 @@
         <w:t>Las asignaturas que mayor impacto y motivación han generado en mi formación son aquellas orientadas a la Ciberseguridad Defensiva y Ofensiva, Seguridad Perimetral, Routing &amp; Switching avanzado (CCNA / Cisco Networking Academy), Sistemas Operativos tipo Unix/Linux y Arquitectura de Redes.</w:t>
         <w:br/>
         <w:br/>
-        <w:t>Bajo la exigente mentoría académica del profesor Mauricio Carrera, profundicé en la concepción de que una red no solo debe ser funcional y de alta disponibilidad, sino inherentemente segura (Security by Design). Esto despertó mi pasión por la construcción de laboratorios complejos (Home Lab con Proxmox VE y GNS3), la administración de firewalls pfSense y la detección/prevención de intrusiones con Suricata IPS, orientando mi perfil hacia la ingeniería de seguridad perimetral y respuesta autónoma ante incidentes.</w:t>
+        <w:t>A lo largo de mi formación académica y práctica, profundicé en la concepción de que una red no solo debe ser funcional y de alta disponibilidad, sino inherentemente segura por diseño (Security by Design). Esto despertó mi pasión por la construcción de laboratorios complejos (Home Lab bare-metal con Proxmox VE y emulación con GNS3), la administración avanzada de firewalls pfSense y la detección/prevención de intrusiones con Suricata IPS, orientando mi perfil hacia la ingeniería de seguridad perimetral, la respuesta autónoma ante incidentes (SOAR) y la fortificación de infraestructuras críticas.</w:t>
       </w:r>
     </w:p>
     <w:p/>

</xml_diff>